<commit_message>
Revised all 4 documents
</commit_message>
<xml_diff>
--- a/Assignment2/DemoWebShop/Bug_Report_Demowebshop.docx
+++ b/Assignment2/DemoWebShop/Bug_Report_Demowebshop.docx
@@ -2657,6 +2657,8 @@
         <w:bidi w:val="0"/>
         <w:rPr>
           <w:rFonts w:hint="default" w:ascii="Times New Roman" w:hAnsi="Times New Roman" w:cs="Times New Roman"/>
+          <w:sz w:val="20"/>
+          <w:szCs w:val="20"/>
         </w:rPr>
       </w:pPr>
       <w:r>
@@ -2692,6 +2694,8 @@
         <w:spacing w:after="100"/>
         <w:rPr>
           <w:rFonts w:hint="default" w:ascii="Times New Roman" w:hAnsi="Times New Roman" w:cs="Times New Roman"/>
+          <w:sz w:val="20"/>
+          <w:szCs w:val="20"/>
         </w:rPr>
       </w:pPr>
       <w:r>
@@ -2720,36 +2724,129 @@
       <w:pPr>
         <w:spacing w:after="100"/>
         <w:rPr>
-          <w:rFonts w:hint="default" w:ascii="Times New Roman" w:hAnsi="Times New Roman" w:cs="Times New Roman"/>
-        </w:rPr>
-      </w:pPr>
-      <w:r>
-        <w:rPr>
-          <w:rFonts w:hint="default" w:ascii="Times New Roman" w:hAnsi="Times New Roman" w:eastAsia="Calibri" w:cs="Times New Roman"/>
-          <w:b/>
-          <w:bCs/>
-          <w:color w:val="000000"/>
-          <w:sz w:val="20"/>
-          <w:szCs w:val="20"/>
-        </w:rPr>
-        <w:t xml:space="preserve">Description: </w:t>
-      </w:r>
-      <w:r>
-        <w:rPr>
           <w:rFonts w:hint="default" w:ascii="Times New Roman" w:hAnsi="Times New Roman" w:eastAsia="Calibri" w:cs="Times New Roman"/>
           <w:i w:val="0"/>
           <w:iCs w:val="0"/>
           <w:sz w:val="20"/>
           <w:szCs w:val="20"/>
         </w:rPr>
+      </w:pPr>
+      <w:r>
+        <w:rPr>
+          <w:rFonts w:hint="default" w:ascii="Times New Roman" w:hAnsi="Times New Roman" w:eastAsia="Calibri" w:cs="Times New Roman"/>
+          <w:b/>
+          <w:bCs/>
+          <w:color w:val="000000"/>
+          <w:sz w:val="20"/>
+          <w:szCs w:val="20"/>
+        </w:rPr>
+        <w:t xml:space="preserve">Description: </w:t>
+      </w:r>
+      <w:r>
+        <w:rPr>
+          <w:rFonts w:hint="default" w:ascii="Times New Roman" w:hAnsi="Times New Roman" w:eastAsia="Calibri" w:cs="Times New Roman"/>
+          <w:i w:val="0"/>
+          <w:iCs w:val="0"/>
+          <w:sz w:val="20"/>
+          <w:szCs w:val="20"/>
+        </w:rPr>
         <w:t>The website allows setting up a weak password while registering a user.</w:t>
       </w:r>
     </w:p>
     <w:p>
       <w:pPr>
+        <w:spacing w:before="60" w:after="60"/>
+        <w:rPr>
+          <w:b w:val="0"/>
+          <w:bCs w:val="0"/>
+          <w:sz w:val="20"/>
+          <w:szCs w:val="20"/>
+        </w:rPr>
+      </w:pPr>
+      <w:r>
+        <w:rPr>
+          <w:b w:val="0"/>
+          <w:bCs w:val="0"/>
+          <w:sz w:val="20"/>
+          <w:szCs w:val="20"/>
+          <w:u w:val="single"/>
+        </w:rPr>
+        <w:t>Scope — Why the tested password (“password”) is considered weak:</w:t>
+      </w:r>
+    </w:p>
+    <w:p>
+      <w:pPr>
+        <w:pStyle w:val="9"/>
+        <w:numPr>
+          <w:ilvl w:val="0"/>
+          <w:numId w:val="1"/>
+        </w:numPr>
+        <w:spacing w:after="40"/>
+        <w:rPr>
+          <w:sz w:val="20"/>
+          <w:szCs w:val="20"/>
+        </w:rPr>
+      </w:pPr>
+      <w:r>
+        <w:rPr>
+          <w:sz w:val="20"/>
+          <w:szCs w:val="20"/>
+        </w:rPr>
+        <w:t>It is exactly 8 characters, at the site's stated minimum, with no additional length buffer.</w:t>
+      </w:r>
+    </w:p>
+    <w:p>
+      <w:pPr>
+        <w:pStyle w:val="9"/>
+        <w:numPr>
+          <w:ilvl w:val="0"/>
+          <w:numId w:val="1"/>
+        </w:numPr>
+        <w:spacing w:after="40"/>
+        <w:rPr>
+          <w:sz w:val="20"/>
+          <w:szCs w:val="20"/>
+        </w:rPr>
+      </w:pPr>
+      <w:r>
+        <w:rPr>
+          <w:sz w:val="20"/>
+          <w:szCs w:val="20"/>
+        </w:rPr>
+        <w:t>It uses lowercase letters only — no uppercase letter, digit, or special character is present.</w:t>
+      </w:r>
+    </w:p>
+    <w:p>
+      <w:pPr>
+        <w:pStyle w:val="9"/>
+        <w:numPr>
+          <w:ilvl w:val="0"/>
+          <w:numId w:val="1"/>
+        </w:numPr>
+        <w:spacing w:after="40"/>
+        <w:rPr>
+          <w:rFonts w:hint="default" w:ascii="Times New Roman" w:hAnsi="Times New Roman" w:eastAsia="Calibri" w:cs="Times New Roman"/>
+          <w:i w:val="0"/>
+          <w:iCs w:val="0"/>
+          <w:sz w:val="20"/>
+          <w:szCs w:val="20"/>
+        </w:rPr>
+      </w:pPr>
+      <w:r>
+        <w:rPr>
+          <w:sz w:val="20"/>
+          <w:szCs w:val="20"/>
+        </w:rPr>
+        <w:t>It is one of the most common breached/dictionary passwords (appears on standard “top 10,000 common passwords” lists), so it is trivially guessable.</w:t>
+      </w:r>
+    </w:p>
+    <w:p>
+      <w:pPr>
         <w:spacing w:after="100"/>
         <w:rPr>
           <w:rFonts w:hint="default" w:ascii="Times New Roman" w:hAnsi="Times New Roman" w:cs="Times New Roman"/>
+          <w:sz w:val="20"/>
+          <w:szCs w:val="20"/>
         </w:rPr>
       </w:pPr>
       <w:r>
@@ -2766,18 +2863,24 @@
       <w:r>
         <w:rPr>
           <w:rFonts w:hint="default" w:ascii="Times New Roman" w:hAnsi="Times New Roman" w:cs="Times New Roman"/>
+          <w:sz w:val="20"/>
+          <w:szCs w:val="20"/>
         </w:rPr>
         <w:fldChar w:fldCharType="begin"/>
       </w:r>
       <w:r>
         <w:rPr>
           <w:rFonts w:hint="default" w:ascii="Times New Roman" w:hAnsi="Times New Roman" w:cs="Times New Roman"/>
+          <w:sz w:val="20"/>
+          <w:szCs w:val="20"/>
         </w:rPr>
         <w:instrText xml:space="preserve"> HYPERLINK "http://demowebshop.tricentis.com/register" </w:instrText>
       </w:r>
       <w:r>
         <w:rPr>
           <w:rFonts w:hint="default" w:ascii="Times New Roman" w:hAnsi="Times New Roman" w:cs="Times New Roman"/>
+          <w:sz w:val="20"/>
+          <w:szCs w:val="20"/>
         </w:rPr>
         <w:fldChar w:fldCharType="separate"/>
       </w:r>
@@ -2805,6 +2908,8 @@
         <w:spacing w:before="60" w:after="40"/>
         <w:rPr>
           <w:rFonts w:hint="default" w:ascii="Times New Roman" w:hAnsi="Times New Roman" w:cs="Times New Roman"/>
+          <w:sz w:val="20"/>
+          <w:szCs w:val="20"/>
         </w:rPr>
       </w:pPr>
       <w:r>
@@ -2825,6 +2930,8 @@
         <w:ind w:left="360"/>
         <w:rPr>
           <w:rFonts w:hint="default" w:ascii="Times New Roman" w:hAnsi="Times New Roman" w:cs="Times New Roman"/>
+          <w:sz w:val="20"/>
+          <w:szCs w:val="20"/>
         </w:rPr>
       </w:pPr>
       <w:r>
@@ -2842,6 +2949,8 @@
         <w:ind w:left="360"/>
         <w:rPr>
           <w:rFonts w:hint="default" w:ascii="Times New Roman" w:hAnsi="Times New Roman" w:cs="Times New Roman"/>
+          <w:sz w:val="20"/>
+          <w:szCs w:val="20"/>
         </w:rPr>
       </w:pPr>
       <w:r>
@@ -2859,6 +2968,8 @@
         <w:ind w:left="360"/>
         <w:rPr>
           <w:rFonts w:hint="default" w:ascii="Times New Roman" w:hAnsi="Times New Roman" w:cs="Times New Roman"/>
+          <w:sz w:val="20"/>
+          <w:szCs w:val="20"/>
         </w:rPr>
       </w:pPr>
       <w:r>
@@ -2876,6 +2987,8 @@
         <w:ind w:left="360"/>
         <w:rPr>
           <w:rFonts w:hint="default" w:ascii="Times New Roman" w:hAnsi="Times New Roman" w:cs="Times New Roman"/>
+          <w:sz w:val="20"/>
+          <w:szCs w:val="20"/>
         </w:rPr>
       </w:pPr>
       <w:r>
@@ -2893,6 +3006,8 @@
         <w:ind w:left="360"/>
         <w:rPr>
           <w:rFonts w:hint="default" w:ascii="Times New Roman" w:hAnsi="Times New Roman" w:cs="Times New Roman"/>
+          <w:sz w:val="20"/>
+          <w:szCs w:val="20"/>
         </w:rPr>
       </w:pPr>
       <w:r>
@@ -2910,6 +3025,8 @@
         <w:ind w:left="360"/>
         <w:rPr>
           <w:rFonts w:hint="default" w:ascii="Times New Roman" w:hAnsi="Times New Roman" w:cs="Times New Roman"/>
+          <w:sz w:val="20"/>
+          <w:szCs w:val="20"/>
         </w:rPr>
       </w:pPr>
       <w:r>
@@ -2927,6 +3044,8 @@
         <w:ind w:left="360"/>
         <w:rPr>
           <w:rFonts w:hint="default" w:ascii="Times New Roman" w:hAnsi="Times New Roman" w:cs="Times New Roman"/>
+          <w:sz w:val="20"/>
+          <w:szCs w:val="20"/>
         </w:rPr>
       </w:pPr>
       <w:r>
@@ -2943,6 +3062,8 @@
         <w:spacing w:before="100" w:after="40"/>
         <w:rPr>
           <w:rFonts w:hint="default" w:ascii="Times New Roman" w:hAnsi="Times New Roman" w:cs="Times New Roman"/>
+          <w:sz w:val="20"/>
+          <w:szCs w:val="20"/>
         </w:rPr>
       </w:pPr>
       <w:r>
@@ -2963,6 +3084,8 @@
         <w:ind w:left="360"/>
         <w:rPr>
           <w:rFonts w:hint="default" w:ascii="Times New Roman" w:hAnsi="Times New Roman" w:cs="Times New Roman"/>
+          <w:sz w:val="20"/>
+          <w:szCs w:val="20"/>
         </w:rPr>
       </w:pPr>
       <w:r>
@@ -2998,6 +3121,8 @@
         <w:ind w:left="360"/>
         <w:rPr>
           <w:rFonts w:hint="default" w:ascii="Times New Roman" w:hAnsi="Times New Roman" w:cs="Times New Roman"/>
+          <w:sz w:val="20"/>
+          <w:szCs w:val="20"/>
         </w:rPr>
       </w:pPr>
       <w:r>
@@ -3033,6 +3158,8 @@
         <w:ind w:left="360"/>
         <w:rPr>
           <w:rFonts w:hint="default" w:ascii="Times New Roman" w:hAnsi="Times New Roman" w:cs="Times New Roman"/>
+          <w:sz w:val="20"/>
+          <w:szCs w:val="20"/>
         </w:rPr>
       </w:pPr>
       <w:r>
@@ -3068,6 +3195,9 @@
         <w:ind w:left="360"/>
         <w:rPr>
           <w:rFonts w:hint="default" w:ascii="Times New Roman" w:hAnsi="Times New Roman" w:cs="Times New Roman"/>
+          <w:sz w:val="20"/>
+          <w:szCs w:val="20"/>
+          <w:lang w:val="en-US"/>
         </w:rPr>
       </w:pPr>
       <w:r>
@@ -3095,6 +3225,15 @@
           <w:szCs w:val="20"/>
         </w:rPr>
         <w:t>s</w:t>
+      </w:r>
+      <w:r>
+        <w:rPr>
+          <w:rFonts w:hint="default" w:ascii="Times New Roman" w:hAnsi="Times New Roman" w:cs="Times New Roman"/>
+          <w:sz w:val="20"/>
+          <w:szCs w:val="20"/>
+          <w:lang w:val="en-US"/>
+        </w:rPr>
+        <w:t>aransh</w:t>
       </w:r>
     </w:p>
     <w:p>
@@ -3103,6 +3242,9 @@
         <w:ind w:left="360"/>
         <w:rPr>
           <w:rFonts w:hint="default" w:ascii="Times New Roman" w:hAnsi="Times New Roman" w:cs="Times New Roman"/>
+          <w:sz w:val="20"/>
+          <w:szCs w:val="20"/>
+          <w:lang w:val="en-US"/>
         </w:rPr>
       </w:pPr>
       <w:r>
@@ -3131,12 +3273,23 @@
         </w:rPr>
         <w:t>v</w:t>
       </w:r>
+      <w:r>
+        <w:rPr>
+          <w:rFonts w:hint="default" w:ascii="Times New Roman" w:hAnsi="Times New Roman" w:cs="Times New Roman"/>
+          <w:sz w:val="20"/>
+          <w:szCs w:val="20"/>
+          <w:lang w:val="en-US"/>
+        </w:rPr>
+        <w:t>erma</w:t>
+      </w:r>
     </w:p>
     <w:p>
       <w:pPr>
         <w:spacing w:before="100" w:after="0"/>
         <w:rPr>
           <w:rFonts w:hint="default" w:ascii="Times New Roman" w:hAnsi="Times New Roman" w:cs="Times New Roman"/>
+          <w:sz w:val="20"/>
+          <w:szCs w:val="20"/>
         </w:rPr>
       </w:pPr>
     </w:p>
@@ -3145,6 +3298,8 @@
         <w:spacing w:after="100"/>
         <w:rPr>
           <w:rFonts w:hint="default" w:ascii="Times New Roman" w:hAnsi="Times New Roman" w:cs="Times New Roman"/>
+          <w:sz w:val="20"/>
+          <w:szCs w:val="20"/>
         </w:rPr>
       </w:pPr>
       <w:r>
@@ -3176,6 +3331,8 @@
           <w:rFonts w:hint="default" w:ascii="Times New Roman" w:hAnsi="Times New Roman" w:cs="Times New Roman"/>
           <w:i w:val="0"/>
           <w:iCs w:val="0"/>
+          <w:sz w:val="20"/>
+          <w:szCs w:val="20"/>
         </w:rPr>
       </w:pPr>
       <w:r>
@@ -3217,29 +3374,50 @@
       <w:pPr>
         <w:spacing w:after="100"/>
         <w:rPr>
-          <w:rFonts w:hint="default" w:ascii="Times New Roman" w:hAnsi="Times New Roman" w:cs="Times New Roman"/>
-        </w:rPr>
-      </w:pPr>
-      <w:r>
-        <w:rPr>
-          <w:rFonts w:hint="default" w:ascii="Times New Roman" w:hAnsi="Times New Roman" w:eastAsia="Calibri" w:cs="Times New Roman"/>
-          <w:b/>
-          <w:bCs/>
-          <w:color w:val="000000"/>
-          <w:sz w:val="20"/>
-          <w:szCs w:val="20"/>
-        </w:rPr>
-        <w:t xml:space="preserve">Attachment: </w:t>
-      </w:r>
-      <w:r>
-        <w:rPr>
-          <w:rFonts w:hint="default" w:ascii="Times New Roman" w:hAnsi="Times New Roman" w:cs="Times New Roman"/>
-        </w:rPr>
+          <w:rFonts w:hint="default" w:ascii="Times New Roman" w:hAnsi="Times New Roman" w:eastAsia="Calibri" w:cs="Times New Roman"/>
+          <w:b/>
+          <w:bCs/>
+          <w:color w:val="000000"/>
+          <w:sz w:val="20"/>
+          <w:szCs w:val="20"/>
+        </w:rPr>
+      </w:pPr>
+      <w:r>
+        <w:rPr>
+          <w:rFonts w:hint="default" w:ascii="Times New Roman" w:hAnsi="Times New Roman" w:eastAsia="Calibri" w:cs="Times New Roman"/>
+          <w:b/>
+          <w:bCs/>
+          <w:color w:val="000000"/>
+          <w:sz w:val="20"/>
+          <w:szCs w:val="20"/>
+        </w:rPr>
+        <w:t>Attachment:</w:t>
+      </w:r>
+    </w:p>
+    <w:p>
+      <w:pPr>
+        <w:spacing w:after="100"/>
+        <w:rPr>
+          <w:rFonts w:hint="default" w:ascii="Times New Roman" w:hAnsi="Times New Roman" w:cs="Times New Roman"/>
+        </w:rPr>
+      </w:pPr>
+      <w:r>
+        <w:rPr>
+          <w:rFonts w:hint="default" w:ascii="Times New Roman" w:hAnsi="Times New Roman" w:eastAsia="Calibri" w:cs="Times New Roman"/>
+          <w:b/>
+          <w:bCs/>
+          <w:color w:val="000000"/>
+          <w:sz w:val="20"/>
+          <w:szCs w:val="20"/>
+        </w:rPr>
+        <w:t xml:space="preserve"> </w:t>
+      </w:r>
+      <w:r>
         <w:drawing>
           <wp:inline distT="0" distB="0" distL="114300" distR="114300">
-            <wp:extent cx="6991350" cy="3276600"/>
-            <wp:effectExtent l="0" t="0" r="0" b="0"/>
-            <wp:docPr id="1" name="Picture 1" descr="IMG_256"/>
+            <wp:extent cx="4276725" cy="2162810"/>
+            <wp:effectExtent l="0" t="0" r="9525" b="8890"/>
+            <wp:docPr id="12" name="Picture 1"/>
             <wp:cNvGraphicFramePr>
               <a:graphicFrameLocks xmlns:a="http://schemas.openxmlformats.org/drawingml/2006/main" noChangeAspect="1"/>
             </wp:cNvGraphicFramePr>
@@ -3247,7 +3425,7 @@
               <a:graphicData uri="http://schemas.openxmlformats.org/drawingml/2006/picture">
                 <pic:pic xmlns:pic="http://schemas.openxmlformats.org/drawingml/2006/picture">
                   <pic:nvPicPr>
-                    <pic:cNvPr id="1" name="Picture 1" descr="IMG_256"/>
+                    <pic:cNvPr id="12" name="Picture 1"/>
                     <pic:cNvPicPr>
                       <a:picLocks noChangeAspect="1"/>
                     </pic:cNvPicPr>
@@ -3261,13 +3439,13 @@
                   <pic:spPr>
                     <a:xfrm>
                       <a:off x="0" y="0"/>
-                      <a:ext cx="6991350" cy="3276600"/>
+                      <a:ext cx="4276725" cy="2162810"/>
                     </a:xfrm>
                     <a:prstGeom prst="rect">
                       <a:avLst/>
                     </a:prstGeom>
                     <a:noFill/>
-                    <a:ln w="9525">
+                    <a:ln>
                       <a:noFill/>
                     </a:ln>
                   </pic:spPr>
@@ -3303,7 +3481,33 @@
         <w:rPr>
           <w:rFonts w:hint="default"/>
         </w:rPr>
-        <w:t>BG02  —  Invalid Username Registration</w:t>
+        <w:t xml:space="preserve">BG02  —  Invalid </w:t>
+      </w:r>
+      <w:r>
+        <w:rPr>
+          <w:rFonts w:hint="default"/>
+          <w:lang w:val="en-US"/>
+        </w:rPr>
+        <w:t>N</w:t>
+      </w:r>
+      <w:r>
+        <w:rPr>
+          <w:rFonts w:hint="default"/>
+        </w:rPr>
+        <w:t>ame</w:t>
+      </w:r>
+      <w:r>
+        <w:rPr>
+          <w:rFonts w:hint="default"/>
+          <w:lang w:val="en-US"/>
+        </w:rPr>
+        <w:t>(First and Last)</w:t>
+      </w:r>
+      <w:r>
+        <w:rPr>
+          <w:rFonts w:hint="default"/>
+        </w:rPr>
+        <w:t xml:space="preserve"> Registration</w:t>
       </w:r>
     </w:p>
     <w:p>
@@ -3368,29 +3572,98 @@
       <w:pPr>
         <w:spacing w:after="100"/>
         <w:rPr>
-          <w:rFonts w:hint="default" w:ascii="Times New Roman" w:hAnsi="Times New Roman" w:cs="Times New Roman"/>
-        </w:rPr>
-      </w:pPr>
-      <w:r>
-        <w:rPr>
-          <w:rFonts w:hint="default" w:ascii="Times New Roman" w:hAnsi="Times New Roman" w:eastAsia="Calibri" w:cs="Times New Roman"/>
-          <w:b/>
-          <w:bCs/>
-          <w:color w:val="000000"/>
-          <w:sz w:val="20"/>
-          <w:szCs w:val="20"/>
-        </w:rPr>
-        <w:t xml:space="preserve">Description: </w:t>
-      </w:r>
-      <w:r>
-        <w:rPr>
           <w:rFonts w:hint="default" w:ascii="Times New Roman" w:hAnsi="Times New Roman" w:eastAsia="Calibri" w:cs="Times New Roman"/>
           <w:i w:val="0"/>
           <w:iCs w:val="0"/>
           <w:sz w:val="20"/>
           <w:szCs w:val="20"/>
         </w:rPr>
+      </w:pPr>
+      <w:r>
+        <w:rPr>
+          <w:rFonts w:hint="default" w:ascii="Times New Roman" w:hAnsi="Times New Roman" w:eastAsia="Calibri" w:cs="Times New Roman"/>
+          <w:b/>
+          <w:bCs/>
+          <w:color w:val="000000"/>
+          <w:sz w:val="20"/>
+          <w:szCs w:val="20"/>
+        </w:rPr>
+        <w:t xml:space="preserve">Description: </w:t>
+      </w:r>
+      <w:r>
+        <w:rPr>
+          <w:rFonts w:hint="default" w:ascii="Times New Roman" w:hAnsi="Times New Roman" w:eastAsia="Calibri" w:cs="Times New Roman"/>
+          <w:i w:val="0"/>
+          <w:iCs w:val="0"/>
+          <w:sz w:val="20"/>
+          <w:szCs w:val="20"/>
+        </w:rPr>
         <w:t>The website allows a username containing special characters / invalid input to be entered.</w:t>
+      </w:r>
+    </w:p>
+    <w:p>
+      <w:pPr>
+        <w:spacing w:before="60" w:after="60"/>
+        <w:rPr>
+          <w:sz w:val="20"/>
+          <w:szCs w:val="20"/>
+        </w:rPr>
+      </w:pPr>
+      <w:r>
+        <w:rPr>
+          <w:b/>
+          <w:bCs/>
+          <w:sz w:val="20"/>
+          <w:szCs w:val="20"/>
+          <w:u w:val="none"/>
+        </w:rPr>
+        <w:t>Scope — What is considered an invalid First Name here:</w:t>
+      </w:r>
+    </w:p>
+    <w:p>
+      <w:pPr>
+        <w:pStyle w:val="9"/>
+        <w:numPr>
+          <w:ilvl w:val="0"/>
+          <w:numId w:val="1"/>
+        </w:numPr>
+        <w:spacing w:after="40"/>
+        <w:rPr>
+          <w:sz w:val="20"/>
+          <w:szCs w:val="20"/>
+        </w:rPr>
+      </w:pPr>
+      <w:r>
+        <w:rPr>
+          <w:sz w:val="20"/>
+          <w:szCs w:val="20"/>
+        </w:rPr>
+        <w:t>An empty/blank value (field left untouched) submitted as a mandatory field.</w:t>
+      </w:r>
+    </w:p>
+    <w:p>
+      <w:pPr>
+        <w:pStyle w:val="9"/>
+        <w:numPr>
+          <w:ilvl w:val="0"/>
+          <w:numId w:val="1"/>
+        </w:numPr>
+        <w:spacing w:after="40"/>
+        <w:rPr>
+          <w:rFonts w:hint="default" w:ascii="Times New Roman" w:hAnsi="Times New Roman" w:eastAsia="Calibri" w:cs="Times New Roman"/>
+          <w:i w:val="0"/>
+          <w:iCs w:val="0"/>
+          <w:sz w:val="20"/>
+          <w:szCs w:val="20"/>
+          <w:lang w:val="en-US"/>
+        </w:rPr>
+      </w:pPr>
+      <w:r>
+        <w:rPr>
+          <w:sz w:val="20"/>
+          <w:szCs w:val="20"/>
+        </w:rPr>
+        <w:t>Would also include values consisting only of digits or special characters, per the same rule applied in BG07.</w:t>
       </w:r>
     </w:p>
     <w:p>
@@ -3880,8 +4153,8 @@
         </w:rPr>
         <w:drawing>
           <wp:inline distT="0" distB="0" distL="114300" distR="114300">
-            <wp:extent cx="6391275" cy="3695700"/>
-            <wp:effectExtent l="0" t="0" r="9525" b="0"/>
+            <wp:extent cx="6391275" cy="2336800"/>
+            <wp:effectExtent l="0" t="0" r="9525" b="6350"/>
             <wp:docPr id="2" name="Picture 2" descr="IMG_256"/>
             <wp:cNvGraphicFramePr>
               <a:graphicFrameLocks xmlns:a="http://schemas.openxmlformats.org/drawingml/2006/main" noChangeAspect="1"/>
@@ -3904,7 +4177,7 @@
                   <pic:spPr>
                     <a:xfrm>
                       <a:off x="0" y="0"/>
-                      <a:ext cx="6391275" cy="3695700"/>
+                      <a:ext cx="6391275" cy="2336800"/>
                     </a:xfrm>
                     <a:prstGeom prst="rect">
                       <a:avLst/>
@@ -4254,6 +4527,7 @@
         <w:ind w:left="360"/>
         <w:rPr>
           <w:rFonts w:hint="default" w:ascii="Times New Roman" w:hAnsi="Times New Roman" w:cs="Times New Roman"/>
+          <w:lang w:val="en-US"/>
         </w:rPr>
       </w:pPr>
       <w:r>
@@ -4280,7 +4554,16 @@
           <w:sz w:val="20"/>
           <w:szCs w:val="20"/>
         </w:rPr>
-        <w:t>s v</w:t>
+        <w:t>s</w:t>
+      </w:r>
+      <w:r>
+        <w:rPr>
+          <w:rFonts w:hint="default" w:ascii="Times New Roman" w:hAnsi="Times New Roman" w:cs="Times New Roman"/>
+          <w:sz w:val="20"/>
+          <w:szCs w:val="20"/>
+          <w:lang w:val="en-US"/>
+        </w:rPr>
+        <w:t>aransh verma</w:t>
       </w:r>
     </w:p>
     <w:p>
@@ -4324,6 +4607,7 @@
         <w:ind w:left="360"/>
         <w:rPr>
           <w:rFonts w:hint="default" w:ascii="Times New Roman" w:hAnsi="Times New Roman" w:cs="Times New Roman"/>
+          <w:lang w:val="en-US"/>
         </w:rPr>
       </w:pPr>
       <w:r>
@@ -4350,7 +4634,16 @@
           <w:sz w:val="20"/>
           <w:szCs w:val="20"/>
         </w:rPr>
-        <w:t>a v</w:t>
+        <w:t>a</w:t>
+      </w:r>
+      <w:r>
+        <w:rPr>
+          <w:rFonts w:hint="default" w:ascii="Times New Roman" w:hAnsi="Times New Roman" w:cs="Times New Roman"/>
+          <w:sz w:val="20"/>
+          <w:szCs w:val="20"/>
+          <w:lang w:val="en-US"/>
+        </w:rPr>
+        <w:t>nsh verma</w:t>
       </w:r>
     </w:p>
     <w:p>
@@ -4541,18 +4834,13 @@
           <w:szCs w:val="20"/>
         </w:rPr>
       </w:pPr>
-      <w:r>
-        <w:rPr>
-          <w:rFonts w:hint="default" w:ascii="Times New Roman" w:hAnsi="Times New Roman" w:eastAsia="SimSun" w:cs="Times New Roman"/>
-          <w:sz w:val="24"/>
-          <w:szCs w:val="24"/>
-          <w:lang w:val="en-US"/>
-        </w:rPr>
+      <w:bookmarkStart w:id="0" w:name="_GoBack"/>
+      <w:r>
         <w:drawing>
           <wp:inline distT="0" distB="0" distL="114300" distR="114300">
-            <wp:extent cx="4328160" cy="3188335"/>
-            <wp:effectExtent l="0" t="0" r="15240" b="12065"/>
-            <wp:docPr id="3" name="Picture 3" descr="Screenshot 2026-07-16 165123"/>
+            <wp:extent cx="5345430" cy="3753485"/>
+            <wp:effectExtent l="0" t="0" r="7620" b="18415"/>
+            <wp:docPr id="15" name="Picture 4"/>
             <wp:cNvGraphicFramePr>
               <a:graphicFrameLocks xmlns:a="http://schemas.openxmlformats.org/drawingml/2006/main" noChangeAspect="1"/>
             </wp:cNvGraphicFramePr>
@@ -4560,7 +4848,7 @@
               <a:graphicData uri="http://schemas.openxmlformats.org/drawingml/2006/picture">
                 <pic:pic xmlns:pic="http://schemas.openxmlformats.org/drawingml/2006/picture">
                   <pic:nvPicPr>
-                    <pic:cNvPr id="3" name="Picture 3" descr="Screenshot 2026-07-16 165123"/>
+                    <pic:cNvPr id="15" name="Picture 4"/>
                     <pic:cNvPicPr>
                       <a:picLocks noChangeAspect="1"/>
                     </pic:cNvPicPr>
@@ -4574,11 +4862,15 @@
                   <pic:spPr>
                     <a:xfrm>
                       <a:off x="0" y="0"/>
-                      <a:ext cx="4328160" cy="3188335"/>
+                      <a:ext cx="5345430" cy="3753485"/>
                     </a:xfrm>
                     <a:prstGeom prst="rect">
                       <a:avLst/>
                     </a:prstGeom>
+                    <a:noFill/>
+                    <a:ln>
+                      <a:noFill/>
+                    </a:ln>
                   </pic:spPr>
                 </pic:pic>
               </a:graphicData>
@@ -4586,6 +4878,7 @@
           </wp:inline>
         </w:drawing>
       </w:r>
+      <w:bookmarkEnd w:id="0"/>
     </w:p>
     <w:p>
       <w:pPr>
@@ -4677,29 +4970,119 @@
       <w:pPr>
         <w:spacing w:after="100"/>
         <w:rPr>
-          <w:rFonts w:hint="default" w:ascii="Times New Roman" w:hAnsi="Times New Roman" w:cs="Times New Roman"/>
-        </w:rPr>
-      </w:pPr>
-      <w:r>
-        <w:rPr>
-          <w:rFonts w:hint="default" w:ascii="Times New Roman" w:hAnsi="Times New Roman" w:eastAsia="Calibri" w:cs="Times New Roman"/>
-          <w:b/>
-          <w:bCs/>
-          <w:color w:val="000000"/>
-          <w:sz w:val="20"/>
-          <w:szCs w:val="20"/>
-        </w:rPr>
-        <w:t xml:space="preserve">Description: </w:t>
-      </w:r>
-      <w:r>
-        <w:rPr>
           <w:rFonts w:hint="default" w:ascii="Times New Roman" w:hAnsi="Times New Roman" w:eastAsia="Calibri" w:cs="Times New Roman"/>
           <w:i w:val="0"/>
           <w:iCs w:val="0"/>
           <w:sz w:val="20"/>
           <w:szCs w:val="20"/>
         </w:rPr>
+      </w:pPr>
+      <w:r>
+        <w:rPr>
+          <w:rFonts w:hint="default" w:ascii="Times New Roman" w:hAnsi="Times New Roman" w:eastAsia="Calibri" w:cs="Times New Roman"/>
+          <w:b/>
+          <w:bCs/>
+          <w:color w:val="000000"/>
+          <w:sz w:val="20"/>
+          <w:szCs w:val="20"/>
+        </w:rPr>
+        <w:t xml:space="preserve">Description: </w:t>
+      </w:r>
+      <w:r>
+        <w:rPr>
+          <w:rFonts w:hint="default" w:ascii="Times New Roman" w:hAnsi="Times New Roman" w:eastAsia="Calibri" w:cs="Times New Roman"/>
+          <w:i w:val="0"/>
+          <w:iCs w:val="0"/>
+          <w:sz w:val="20"/>
+          <w:szCs w:val="20"/>
+        </w:rPr>
         <w:t>The website allows entering an invalid ZIP code in the shipping estimate functionality.</w:t>
+      </w:r>
+    </w:p>
+    <w:p>
+      <w:pPr>
+        <w:spacing w:before="60" w:after="60"/>
+        <w:rPr>
+          <w:sz w:val="20"/>
+          <w:szCs w:val="20"/>
+          <w:u w:val="none"/>
+        </w:rPr>
+      </w:pPr>
+      <w:r>
+        <w:rPr>
+          <w:b/>
+          <w:bCs/>
+          <w:sz w:val="20"/>
+          <w:szCs w:val="20"/>
+          <w:u w:val="none"/>
+        </w:rPr>
+        <w:t>Scope — Why 11111 is invalid for the selected state (Alaska):</w:t>
+      </w:r>
+    </w:p>
+    <w:p>
+      <w:pPr>
+        <w:pStyle w:val="9"/>
+        <w:numPr>
+          <w:ilvl w:val="0"/>
+          <w:numId w:val="1"/>
+        </w:numPr>
+        <w:spacing w:after="40"/>
+        <w:rPr>
+          <w:sz w:val="20"/>
+          <w:szCs w:val="20"/>
+        </w:rPr>
+      </w:pPr>
+      <w:r>
+        <w:rPr>
+          <w:sz w:val="20"/>
+          <w:szCs w:val="20"/>
+        </w:rPr>
+        <w:t>It is numerically well-formed (5 digits), so a simple “is it numeric / 5 digits” check would pass it.</w:t>
+      </w:r>
+    </w:p>
+    <w:p>
+      <w:pPr>
+        <w:pStyle w:val="9"/>
+        <w:numPr>
+          <w:ilvl w:val="0"/>
+          <w:numId w:val="1"/>
+        </w:numPr>
+        <w:spacing w:after="40"/>
+        <w:rPr>
+          <w:sz w:val="20"/>
+          <w:szCs w:val="20"/>
+        </w:rPr>
+      </w:pPr>
+      <w:r>
+        <w:rPr>
+          <w:sz w:val="20"/>
+          <w:szCs w:val="20"/>
+        </w:rPr>
+        <w:t>However, real USPS ZIP codes for Alaska fall in the range 99501–99950; 11111 falls within a New York-area range instead, so it cannot belong to the selected state.</w:t>
+      </w:r>
+    </w:p>
+    <w:p>
+      <w:pPr>
+        <w:pStyle w:val="9"/>
+        <w:numPr>
+          <w:ilvl w:val="0"/>
+          <w:numId w:val="1"/>
+        </w:numPr>
+        <w:spacing w:after="40"/>
+        <w:rPr>
+          <w:rFonts w:hint="default" w:ascii="Times New Roman" w:hAnsi="Times New Roman" w:eastAsia="Calibri" w:cs="Times New Roman"/>
+          <w:i w:val="0"/>
+          <w:iCs w:val="0"/>
+          <w:sz w:val="20"/>
+          <w:szCs w:val="20"/>
+        </w:rPr>
+      </w:pPr>
+      <w:r>
+        <w:rPr>
+          <w:sz w:val="20"/>
+          <w:szCs w:val="20"/>
+        </w:rPr>
+        <w:t>Minimum expected validation: the ZIP must be 5 numeric digits (US format) AND fall within the valid range/list for the selected state.</w:t>
       </w:r>
     </w:p>
     <w:p>
@@ -5702,13 +6085,27 @@
         <w:bidi w:val="0"/>
         <w:rPr>
           <w:rFonts w:hint="default"/>
+          <w:lang w:val="en-US"/>
         </w:rPr>
       </w:pPr>
       <w:r>
         <w:rPr>
           <w:rFonts w:hint="default"/>
         </w:rPr>
-        <w:t>BG06  —  Contact Us Page Accepting Invalid Username</w:t>
+        <w:t xml:space="preserve">BG06  —  Contact Us Page Accepting Invalid </w:t>
+      </w:r>
+      <w:r>
+        <w:rPr>
+          <w:rFonts w:hint="default"/>
+          <w:lang w:val="en-US"/>
+        </w:rPr>
+        <w:t>N</w:t>
+      </w:r>
+      <w:r>
+        <w:rPr>
+          <w:rFonts w:hint="default"/>
+        </w:rPr>
+        <w:t>ame</w:t>
       </w:r>
     </w:p>
     <w:p>
@@ -5773,29 +6170,97 @@
       <w:pPr>
         <w:spacing w:after="100"/>
         <w:rPr>
-          <w:rFonts w:hint="default" w:ascii="Times New Roman" w:hAnsi="Times New Roman" w:cs="Times New Roman"/>
-        </w:rPr>
-      </w:pPr>
-      <w:r>
-        <w:rPr>
-          <w:rFonts w:hint="default" w:ascii="Times New Roman" w:hAnsi="Times New Roman" w:eastAsia="Calibri" w:cs="Times New Roman"/>
-          <w:b/>
-          <w:bCs/>
-          <w:color w:val="000000"/>
-          <w:sz w:val="20"/>
-          <w:szCs w:val="20"/>
-        </w:rPr>
-        <w:t xml:space="preserve">Description: </w:t>
-      </w:r>
-      <w:r>
-        <w:rPr>
           <w:rFonts w:hint="default" w:ascii="Times New Roman" w:hAnsi="Times New Roman" w:eastAsia="Calibri" w:cs="Times New Roman"/>
           <w:i w:val="0"/>
           <w:iCs w:val="0"/>
           <w:sz w:val="20"/>
           <w:szCs w:val="20"/>
         </w:rPr>
+      </w:pPr>
+      <w:r>
+        <w:rPr>
+          <w:rFonts w:hint="default" w:ascii="Times New Roman" w:hAnsi="Times New Roman" w:eastAsia="Calibri" w:cs="Times New Roman"/>
+          <w:b/>
+          <w:bCs/>
+          <w:color w:val="000000"/>
+          <w:sz w:val="20"/>
+          <w:szCs w:val="20"/>
+        </w:rPr>
+        <w:t xml:space="preserve">Description: </w:t>
+      </w:r>
+      <w:r>
+        <w:rPr>
+          <w:rFonts w:hint="default" w:ascii="Times New Roman" w:hAnsi="Times New Roman" w:eastAsia="Calibri" w:cs="Times New Roman"/>
+          <w:i w:val="0"/>
+          <w:iCs w:val="0"/>
+          <w:sz w:val="20"/>
+          <w:szCs w:val="20"/>
+        </w:rPr>
         <w:t>The Contact Us page accepts an invalid name, i.e., a name containing special characters can be entered.</w:t>
+      </w:r>
+    </w:p>
+    <w:p>
+      <w:pPr>
+        <w:spacing w:before="60" w:after="60"/>
+        <w:rPr>
+          <w:sz w:val="20"/>
+          <w:szCs w:val="20"/>
+        </w:rPr>
+      </w:pPr>
+      <w:r>
+        <w:rPr>
+          <w:b/>
+          <w:bCs/>
+          <w:sz w:val="20"/>
+          <w:szCs w:val="20"/>
+          <w:u w:val="none"/>
+        </w:rPr>
+        <w:t>Scope — What is considered an invalid Name here:</w:t>
+      </w:r>
+    </w:p>
+    <w:p>
+      <w:pPr>
+        <w:pStyle w:val="9"/>
+        <w:numPr>
+          <w:ilvl w:val="0"/>
+          <w:numId w:val="1"/>
+        </w:numPr>
+        <w:spacing w:after="40"/>
+        <w:rPr>
+          <w:sz w:val="20"/>
+          <w:szCs w:val="20"/>
+        </w:rPr>
+      </w:pPr>
+      <w:r>
+        <w:rPr>
+          <w:sz w:val="20"/>
+          <w:szCs w:val="20"/>
+        </w:rPr>
+        <w:t>A blank/empty submission of the mandatory Name field.</w:t>
+      </w:r>
+    </w:p>
+    <w:p>
+      <w:pPr>
+        <w:pStyle w:val="9"/>
+        <w:numPr>
+          <w:ilvl w:val="0"/>
+          <w:numId w:val="1"/>
+        </w:numPr>
+        <w:spacing w:after="40"/>
+        <w:rPr>
+          <w:rFonts w:hint="default" w:ascii="Times New Roman" w:hAnsi="Times New Roman" w:eastAsia="Calibri" w:cs="Times New Roman"/>
+          <w:i w:val="0"/>
+          <w:iCs w:val="0"/>
+          <w:sz w:val="20"/>
+          <w:szCs w:val="20"/>
+        </w:rPr>
+      </w:pPr>
+      <w:r>
+        <w:rPr>
+          <w:sz w:val="20"/>
+          <w:szCs w:val="20"/>
+        </w:rPr>
+        <w:t>A value consisting solely of special characters (e.g., @#$%^&amp;*) or digits, with no alphabetic content.</w:t>
       </w:r>
     </w:p>
     <w:p>
@@ -6358,29 +6823,140 @@
       <w:pPr>
         <w:spacing w:after="100"/>
         <w:rPr>
-          <w:rFonts w:hint="default" w:ascii="Times New Roman" w:hAnsi="Times New Roman" w:cs="Times New Roman"/>
-        </w:rPr>
-      </w:pPr>
-      <w:r>
-        <w:rPr>
-          <w:rFonts w:hint="default" w:ascii="Times New Roman" w:hAnsi="Times New Roman" w:eastAsia="Calibri" w:cs="Times New Roman"/>
-          <w:b/>
-          <w:bCs/>
-          <w:color w:val="000000"/>
-          <w:sz w:val="20"/>
-          <w:szCs w:val="20"/>
-        </w:rPr>
-        <w:t xml:space="preserve">Description: </w:t>
-      </w:r>
-      <w:r>
-        <w:rPr>
           <w:rFonts w:hint="default" w:ascii="Times New Roman" w:hAnsi="Times New Roman" w:eastAsia="Calibri" w:cs="Times New Roman"/>
           <w:i w:val="0"/>
           <w:iCs w:val="0"/>
           <w:sz w:val="20"/>
           <w:szCs w:val="20"/>
         </w:rPr>
+      </w:pPr>
+      <w:r>
+        <w:rPr>
+          <w:rFonts w:hint="default" w:ascii="Times New Roman" w:hAnsi="Times New Roman" w:eastAsia="Calibri" w:cs="Times New Roman"/>
+          <w:b/>
+          <w:bCs/>
+          <w:color w:val="000000"/>
+          <w:sz w:val="20"/>
+          <w:szCs w:val="20"/>
+        </w:rPr>
+        <w:t xml:space="preserve">Description: </w:t>
+      </w:r>
+      <w:r>
+        <w:rPr>
+          <w:rFonts w:hint="default" w:ascii="Times New Roman" w:hAnsi="Times New Roman" w:eastAsia="Calibri" w:cs="Times New Roman"/>
+          <w:i w:val="0"/>
+          <w:iCs w:val="0"/>
+          <w:sz w:val="20"/>
+          <w:szCs w:val="20"/>
+        </w:rPr>
         <w:t>The My Account / Address page accepts invalid first and last names; special characters can be entered.</w:t>
+      </w:r>
+    </w:p>
+    <w:p>
+      <w:pPr>
+        <w:spacing w:before="60" w:after="60"/>
+        <w:rPr>
+          <w:sz w:val="20"/>
+          <w:szCs w:val="20"/>
+          <w:u w:val="none"/>
+        </w:rPr>
+      </w:pPr>
+      <w:r>
+        <w:rPr>
+          <w:b/>
+          <w:bCs/>
+          <w:sz w:val="20"/>
+          <w:szCs w:val="20"/>
+          <w:u w:val="none"/>
+        </w:rPr>
+        <w:t>Scope — Definition of an invalid name for this test:</w:t>
+      </w:r>
+    </w:p>
+    <w:p>
+      <w:pPr>
+        <w:pStyle w:val="9"/>
+        <w:numPr>
+          <w:ilvl w:val="0"/>
+          <w:numId w:val="1"/>
+        </w:numPr>
+        <w:spacing w:after="40"/>
+        <w:rPr>
+          <w:sz w:val="20"/>
+          <w:szCs w:val="20"/>
+        </w:rPr>
+      </w:pPr>
+      <w:r>
+        <w:rPr>
+          <w:sz w:val="20"/>
+          <w:szCs w:val="20"/>
+        </w:rPr>
+        <w:t>Blank/empty value in a mandatory name field.</w:t>
+      </w:r>
+    </w:p>
+    <w:p>
+      <w:pPr>
+        <w:pStyle w:val="9"/>
+        <w:numPr>
+          <w:ilvl w:val="0"/>
+          <w:numId w:val="1"/>
+        </w:numPr>
+        <w:spacing w:after="40"/>
+        <w:rPr>
+          <w:sz w:val="20"/>
+          <w:szCs w:val="20"/>
+        </w:rPr>
+      </w:pPr>
+      <w:r>
+        <w:rPr>
+          <w:sz w:val="20"/>
+          <w:szCs w:val="20"/>
+        </w:rPr>
+        <w:t>A value made up only of special characters (e.g., **, @, #, %) with no letters.</w:t>
+      </w:r>
+    </w:p>
+    <w:p>
+      <w:pPr>
+        <w:pStyle w:val="9"/>
+        <w:numPr>
+          <w:ilvl w:val="0"/>
+          <w:numId w:val="1"/>
+        </w:numPr>
+        <w:spacing w:after="40"/>
+        <w:rPr>
+          <w:sz w:val="20"/>
+          <w:szCs w:val="20"/>
+        </w:rPr>
+      </w:pPr>
+      <w:r>
+        <w:rPr>
+          <w:sz w:val="20"/>
+          <w:szCs w:val="20"/>
+        </w:rPr>
+        <w:t>(Related, not tested here but recommended for follow-up): values containing digits, e.g. “John123”.</w:t>
+      </w:r>
+    </w:p>
+    <w:p>
+      <w:pPr>
+        <w:pStyle w:val="9"/>
+        <w:numPr>
+          <w:ilvl w:val="0"/>
+          <w:numId w:val="1"/>
+        </w:numPr>
+        <w:spacing w:after="40"/>
+        <w:rPr>
+          <w:rFonts w:hint="default" w:ascii="Times New Roman" w:hAnsi="Times New Roman" w:eastAsia="Calibri" w:cs="Times New Roman"/>
+          <w:i w:val="0"/>
+          <w:iCs w:val="0"/>
+          <w:sz w:val="20"/>
+          <w:szCs w:val="20"/>
+        </w:rPr>
+      </w:pPr>
+      <w:r>
+        <w:rPr>
+          <w:sz w:val="20"/>
+          <w:szCs w:val="20"/>
+        </w:rPr>
+        <w:t>Expected valid format: alphabetic characters only, optionally including spaces, hyphens, or apostrophes for compound names (e.g., “O'Brien”, “Anne-Marie”).</w:t>
       </w:r>
     </w:p>
     <w:p>
@@ -7045,6 +7621,7 @@
         <w:ind w:left="360"/>
         <w:rPr>
           <w:rFonts w:hint="default" w:ascii="Times New Roman" w:hAnsi="Times New Roman" w:cs="Times New Roman"/>
+          <w:lang w:val="en-US"/>
         </w:rPr>
       </w:pPr>
       <w:r>
@@ -7072,6 +7649,15 @@
           <w:szCs w:val="20"/>
         </w:rPr>
         <w:t>a</w:t>
+      </w:r>
+      <w:r>
+        <w:rPr>
+          <w:rFonts w:hint="default" w:ascii="Times New Roman" w:hAnsi="Times New Roman" w:cs="Times New Roman"/>
+          <w:sz w:val="20"/>
+          <w:szCs w:val="20"/>
+          <w:lang w:val="en-US"/>
+        </w:rPr>
+        <w:t>nsh</w:t>
       </w:r>
     </w:p>
     <w:p>
@@ -7080,6 +7666,7 @@
         <w:ind w:left="360"/>
         <w:rPr>
           <w:rFonts w:hint="default" w:ascii="Times New Roman" w:hAnsi="Times New Roman" w:cs="Times New Roman"/>
+          <w:lang w:val="en-US"/>
         </w:rPr>
       </w:pPr>
       <w:r>
@@ -7107,6 +7694,15 @@
           <w:szCs w:val="20"/>
         </w:rPr>
         <w:t>v</w:t>
+      </w:r>
+      <w:r>
+        <w:rPr>
+          <w:rFonts w:hint="default" w:ascii="Times New Roman" w:hAnsi="Times New Roman" w:cs="Times New Roman"/>
+          <w:sz w:val="20"/>
+          <w:szCs w:val="20"/>
+          <w:lang w:val="en-US"/>
+        </w:rPr>
+        <w:t>erma</w:t>
       </w:r>
     </w:p>
     <w:p>
@@ -7273,39 +7869,15 @@
       <w:pPr>
         <w:spacing w:after="100"/>
         <w:rPr>
-          <w:rFonts w:hint="default" w:ascii="Times New Roman" w:hAnsi="Times New Roman" w:eastAsia="Calibri" w:cs="Times New Roman"/>
-          <w:b/>
-          <w:bCs/>
-          <w:color w:val="000000"/>
-          <w:sz w:val="20"/>
-          <w:szCs w:val="20"/>
-          <w:lang w:val="en-US"/>
-        </w:rPr>
-      </w:pPr>
-      <w:r>
-        <w:rPr>
-          <w:rFonts w:hint="default" w:ascii="Times New Roman" w:hAnsi="Times New Roman" w:cs="Times New Roman"/>
-          <w:b/>
-          <w:bCs/>
-          <w:color w:val="000000"/>
-          <w:sz w:val="20"/>
-          <w:szCs w:val="20"/>
-          <w:lang w:val="en-US"/>
-        </w:rPr>
-        <w:tab/>
-      </w:r>
-      <w:r>
-        <w:rPr>
-          <w:rFonts w:hint="default" w:ascii="Times New Roman" w:hAnsi="Times New Roman" w:eastAsia="SimSun" w:cs="Times New Roman"/>
-          <w:sz w:val="24"/>
-          <w:szCs w:val="24"/>
-          <w:lang w:val="en-US"/>
-        </w:rPr>
+          <w:rFonts w:hint="default" w:ascii="Times New Roman" w:hAnsi="Times New Roman" w:cs="Times New Roman"/>
+        </w:rPr>
+      </w:pPr>
+      <w:r>
         <w:drawing>
           <wp:inline distT="0" distB="0" distL="114300" distR="114300">
-            <wp:extent cx="5270500" cy="1220470"/>
-            <wp:effectExtent l="0" t="0" r="6350" b="17780"/>
-            <wp:docPr id="9" name="Picture 9" descr="Screenshot 2026-07-16 174220"/>
+            <wp:extent cx="3390900" cy="1857375"/>
+            <wp:effectExtent l="0" t="0" r="0" b="9525"/>
+            <wp:docPr id="13" name="Picture 2"/>
             <wp:cNvGraphicFramePr>
               <a:graphicFrameLocks xmlns:a="http://schemas.openxmlformats.org/drawingml/2006/main" noChangeAspect="1"/>
             </wp:cNvGraphicFramePr>
@@ -7313,7 +7885,7 @@
               <a:graphicData uri="http://schemas.openxmlformats.org/drawingml/2006/picture">
                 <pic:pic xmlns:pic="http://schemas.openxmlformats.org/drawingml/2006/picture">
                   <pic:nvPicPr>
-                    <pic:cNvPr id="9" name="Picture 9" descr="Screenshot 2026-07-16 174220"/>
+                    <pic:cNvPr id="13" name="Picture 2"/>
                     <pic:cNvPicPr>
                       <a:picLocks noChangeAspect="1"/>
                     </pic:cNvPicPr>
@@ -7327,11 +7899,15 @@
                   <pic:spPr>
                     <a:xfrm>
                       <a:off x="0" y="0"/>
-                      <a:ext cx="5270500" cy="1220470"/>
+                      <a:ext cx="3390900" cy="1857375"/>
                     </a:xfrm>
                     <a:prstGeom prst="rect">
                       <a:avLst/>
                     </a:prstGeom>
+                    <a:noFill/>
+                    <a:ln>
+                      <a:noFill/>
+                    </a:ln>
                   </pic:spPr>
                 </pic:pic>
               </a:graphicData>
@@ -7342,25 +7918,48 @@
     </w:p>
     <w:p>
       <w:pPr>
-        <w:rPr>
-          <w:rFonts w:hint="default" w:ascii="Times New Roman" w:hAnsi="Times New Roman" w:cs="Times New Roman"/>
-        </w:rPr>
-      </w:pPr>
-      <w:r>
-        <w:rPr>
-          <w:rFonts w:hint="default" w:ascii="Times New Roman" w:hAnsi="Times New Roman" w:cs="Times New Roman"/>
-        </w:rPr>
-        <w:br w:type="page"/>
-      </w:r>
-    </w:p>
-    <w:p>
-      <w:pPr>
         <w:pStyle w:val="3"/>
         <w:bidi w:val="0"/>
         <w:rPr>
           <w:rFonts w:hint="default"/>
         </w:rPr>
       </w:pPr>
+    </w:p>
+    <w:p>
+      <w:pPr>
+        <w:pStyle w:val="3"/>
+        <w:bidi w:val="0"/>
+        <w:rPr>
+          <w:rFonts w:hint="default"/>
+        </w:rPr>
+      </w:pPr>
+    </w:p>
+    <w:p>
+      <w:pPr>
+        <w:pStyle w:val="3"/>
+        <w:bidi w:val="0"/>
+        <w:rPr>
+          <w:rFonts w:hint="default"/>
+        </w:rPr>
+      </w:pPr>
+    </w:p>
+    <w:p>
+      <w:pPr>
+        <w:pStyle w:val="3"/>
+        <w:bidi w:val="0"/>
+        <w:rPr>
+          <w:rFonts w:hint="default"/>
+        </w:rPr>
+      </w:pPr>
+    </w:p>
+    <w:p>
+      <w:pPr>
+        <w:pStyle w:val="3"/>
+        <w:bidi w:val="0"/>
+        <w:rPr>
+          <w:rFonts w:hint="default"/>
+        </w:rPr>
+      </w:pPr>
       <w:r>
         <w:rPr>
           <w:rFonts w:hint="default"/>
@@ -7430,29 +8029,96 @@
       <w:pPr>
         <w:spacing w:after="100"/>
         <w:rPr>
-          <w:rFonts w:hint="default" w:ascii="Times New Roman" w:hAnsi="Times New Roman" w:cs="Times New Roman"/>
-        </w:rPr>
-      </w:pPr>
-      <w:r>
-        <w:rPr>
-          <w:rFonts w:hint="default" w:ascii="Times New Roman" w:hAnsi="Times New Roman" w:eastAsia="Calibri" w:cs="Times New Roman"/>
-          <w:b/>
-          <w:bCs/>
-          <w:color w:val="000000"/>
-          <w:sz w:val="20"/>
-          <w:szCs w:val="20"/>
-        </w:rPr>
-        <w:t xml:space="preserve">Description: </w:t>
-      </w:r>
-      <w:r>
-        <w:rPr>
           <w:rFonts w:hint="default" w:ascii="Times New Roman" w:hAnsi="Times New Roman" w:eastAsia="Calibri" w:cs="Times New Roman"/>
           <w:i w:val="0"/>
           <w:iCs w:val="0"/>
           <w:sz w:val="20"/>
           <w:szCs w:val="20"/>
         </w:rPr>
+      </w:pPr>
+      <w:r>
+        <w:rPr>
+          <w:rFonts w:hint="default" w:ascii="Times New Roman" w:hAnsi="Times New Roman" w:eastAsia="Calibri" w:cs="Times New Roman"/>
+          <w:b/>
+          <w:bCs/>
+          <w:color w:val="000000"/>
+          <w:sz w:val="20"/>
+          <w:szCs w:val="20"/>
+        </w:rPr>
+        <w:t xml:space="preserve">Description: </w:t>
+      </w:r>
+      <w:r>
+        <w:rPr>
+          <w:rFonts w:hint="default" w:ascii="Times New Roman" w:hAnsi="Times New Roman" w:eastAsia="Calibri" w:cs="Times New Roman"/>
+          <w:i w:val="0"/>
+          <w:iCs w:val="0"/>
+          <w:sz w:val="20"/>
+          <w:szCs w:val="20"/>
+        </w:rPr>
         <w:t>The My Account / Address page accepts an invalid phone number, including alphabets and special characters.</w:t>
+      </w:r>
+    </w:p>
+    <w:p>
+      <w:pPr>
+        <w:spacing w:before="60" w:after="60"/>
+        <w:rPr>
+          <w:sz w:val="20"/>
+          <w:szCs w:val="20"/>
+          <w:u w:val="none"/>
+        </w:rPr>
+      </w:pPr>
+      <w:r>
+        <w:rPr>
+          <w:b/>
+          <w:bCs/>
+          <w:sz w:val="20"/>
+          <w:szCs w:val="20"/>
+          <w:u w:val="none"/>
+        </w:rPr>
+        <w:t>Scope — Definition of an invalid phone number for this test:</w:t>
+      </w:r>
+    </w:p>
+    <w:p>
+      <w:pPr>
+        <w:pStyle w:val="9"/>
+        <w:numPr>
+          <w:ilvl w:val="0"/>
+          <w:numId w:val="1"/>
+        </w:numPr>
+        <w:spacing w:after="40"/>
+        <w:rPr>
+          <w:sz w:val="20"/>
+          <w:szCs w:val="20"/>
+        </w:rPr>
+      </w:pPr>
+      <w:r>
+        <w:rPr>
+          <w:sz w:val="20"/>
+          <w:szCs w:val="20"/>
+        </w:rPr>
+        <w:t>Contains alphabetic characters and/or special characters instead of digits.</w:t>
+      </w:r>
+    </w:p>
+    <w:p>
+      <w:pPr>
+        <w:spacing w:after="100"/>
+        <w:rPr>
+          <w:rFonts w:hint="default" w:ascii="Times New Roman" w:hAnsi="Times New Roman" w:eastAsia="Calibri" w:cs="Times New Roman"/>
+          <w:i w:val="0"/>
+          <w:iCs w:val="0"/>
+          <w:sz w:val="20"/>
+          <w:szCs w:val="20"/>
+        </w:rPr>
+      </w:pPr>
+      <w:r>
+        <w:rPr>
+          <w:sz w:val="20"/>
+          <w:szCs w:val="20"/>
+        </w:rPr>
+        <w:t>Expected valid format: numeric digits only (optionally with a leading “+” and country code), matching the length/format conventions for the selected country</w:t>
+      </w:r>
+      <w:r>
+        <w:t>.</w:t>
       </w:r>
     </w:p>
     <w:p>
@@ -7656,6 +8322,7 @@
         <w:ind w:left="360"/>
         <w:rPr>
           <w:rFonts w:hint="default" w:ascii="Times New Roman" w:hAnsi="Times New Roman" w:cs="Times New Roman"/>
+          <w:lang w:val="en-US"/>
         </w:rPr>
       </w:pPr>
       <w:r>
@@ -7683,6 +8350,15 @@
           <w:szCs w:val="20"/>
         </w:rPr>
         <w:t>a</w:t>
+      </w:r>
+      <w:r>
+        <w:rPr>
+          <w:rFonts w:hint="default" w:ascii="Times New Roman" w:hAnsi="Times New Roman" w:cs="Times New Roman"/>
+          <w:sz w:val="20"/>
+          <w:szCs w:val="20"/>
+          <w:lang w:val="en-US"/>
+        </w:rPr>
+        <w:t>nsh</w:t>
       </w:r>
     </w:p>
     <w:p>
@@ -7691,6 +8367,7 @@
         <w:ind w:left="360"/>
         <w:rPr>
           <w:rFonts w:hint="default" w:ascii="Times New Roman" w:hAnsi="Times New Roman" w:cs="Times New Roman"/>
+          <w:lang w:val="en-US"/>
         </w:rPr>
       </w:pPr>
       <w:r>
@@ -7718,6 +8395,15 @@
           <w:szCs w:val="20"/>
         </w:rPr>
         <w:t>v</w:t>
+      </w:r>
+      <w:r>
+        <w:rPr>
+          <w:rFonts w:hint="default" w:ascii="Times New Roman" w:hAnsi="Times New Roman" w:cs="Times New Roman"/>
+          <w:sz w:val="20"/>
+          <w:szCs w:val="20"/>
+          <w:lang w:val="en-US"/>
+        </w:rPr>
+        <w:t>erma</w:t>
       </w:r>
     </w:p>
     <w:p>
@@ -7919,7 +8605,12 @@
       <w:pPr>
         <w:spacing w:after="100"/>
         <w:rPr>
-          <w:rFonts w:hint="default" w:ascii="Times New Roman" w:hAnsi="Times New Roman" w:eastAsia="Calibri" w:cs="Times New Roman"/>
+          <w:rFonts w:hint="default" w:ascii="Times New Roman" w:hAnsi="Times New Roman" w:cs="Times New Roman"/>
+        </w:rPr>
+      </w:pPr>
+      <w:r>
+        <w:rPr>
+          <w:rFonts w:hint="default" w:ascii="Times New Roman" w:hAnsi="Times New Roman" w:cs="Times New Roman"/>
           <w:b/>
           <w:bCs/>
           <w:color w:val="000000"/>
@@ -7927,31 +8618,14 @@
           <w:szCs w:val="20"/>
           <w:lang w:val="en-US"/>
         </w:rPr>
-      </w:pPr>
-      <w:r>
-        <w:rPr>
-          <w:rFonts w:hint="default" w:ascii="Times New Roman" w:hAnsi="Times New Roman" w:cs="Times New Roman"/>
-          <w:b/>
-          <w:bCs/>
-          <w:color w:val="000000"/>
-          <w:sz w:val="20"/>
-          <w:szCs w:val="20"/>
-          <w:lang w:val="en-US"/>
-        </w:rPr>
         <w:tab/>
       </w:r>
       <w:r>
-        <w:rPr>
-          <w:rFonts w:hint="default" w:ascii="Times New Roman" w:hAnsi="Times New Roman" w:eastAsia="SimSun" w:cs="Times New Roman"/>
-          <w:sz w:val="24"/>
-          <w:szCs w:val="24"/>
-          <w:lang w:val="en-US"/>
-        </w:rPr>
         <w:drawing>
           <wp:inline distT="0" distB="0" distL="114300" distR="114300">
-            <wp:extent cx="5273675" cy="1168400"/>
-            <wp:effectExtent l="0" t="0" r="3175" b="12700"/>
-            <wp:docPr id="10" name="Picture 10" descr="Screenshot 2026-07-16 174523"/>
+            <wp:extent cx="1905000" cy="1990725"/>
+            <wp:effectExtent l="0" t="0" r="0" b="9525"/>
+            <wp:docPr id="14" name="Picture 3"/>
             <wp:cNvGraphicFramePr>
               <a:graphicFrameLocks xmlns:a="http://schemas.openxmlformats.org/drawingml/2006/main" noChangeAspect="1"/>
             </wp:cNvGraphicFramePr>
@@ -7959,7 +8633,7 @@
               <a:graphicData uri="http://schemas.openxmlformats.org/drawingml/2006/picture">
                 <pic:pic xmlns:pic="http://schemas.openxmlformats.org/drawingml/2006/picture">
                   <pic:nvPicPr>
-                    <pic:cNvPr id="10" name="Picture 10" descr="Screenshot 2026-07-16 174523"/>
+                    <pic:cNvPr id="14" name="Picture 3"/>
                     <pic:cNvPicPr>
                       <a:picLocks noChangeAspect="1"/>
                     </pic:cNvPicPr>
@@ -7973,11 +8647,15 @@
                   <pic:spPr>
                     <a:xfrm>
                       <a:off x="0" y="0"/>
-                      <a:ext cx="5273675" cy="1168400"/>
+                      <a:ext cx="1905000" cy="1990725"/>
                     </a:xfrm>
                     <a:prstGeom prst="rect">
                       <a:avLst/>
                     </a:prstGeom>
+                    <a:noFill/>
+                    <a:ln>
+                      <a:noFill/>
+                    </a:ln>
                   </pic:spPr>
                 </pic:pic>
               </a:graphicData>
@@ -7988,16 +8666,21 @@
     </w:p>
     <w:p>
       <w:pPr>
-        <w:rPr>
-          <w:rFonts w:hint="default" w:ascii="Times New Roman" w:hAnsi="Times New Roman" w:cs="Times New Roman"/>
-        </w:rPr>
-      </w:pPr>
-      <w:r>
-        <w:rPr>
-          <w:rFonts w:hint="default" w:ascii="Times New Roman" w:hAnsi="Times New Roman" w:cs="Times New Roman"/>
-        </w:rPr>
-        <w:br w:type="page"/>
-      </w:r>
+        <w:pStyle w:val="3"/>
+        <w:bidi w:val="0"/>
+        <w:rPr>
+          <w:rFonts w:hint="default"/>
+        </w:rPr>
+      </w:pPr>
+    </w:p>
+    <w:p>
+      <w:pPr>
+        <w:pStyle w:val="3"/>
+        <w:bidi w:val="0"/>
+        <w:rPr>
+          <w:rFonts w:hint="default"/>
+        </w:rPr>
+      </w:pPr>
     </w:p>
     <w:p>
       <w:pPr>
@@ -8414,8 +9097,6 @@
           <w:lang w:val="en-US"/>
         </w:rPr>
       </w:pPr>
-      <w:bookmarkStart w:id="0" w:name="_GoBack"/>
-      <w:bookmarkEnd w:id="0"/>
     </w:p>
     <w:sectPr>
       <w:headerReference r:id="rId3" w:type="default"/>
@@ -8439,6 +9120,103 @@
     </w:pPr>
   </w:p>
 </w:hdr>
+</file>
+
+<file path=word/numbering.xml><?xml version="1.0" encoding="utf-8"?>
+<w:numbering xmlns:wpc="http://schemas.microsoft.com/office/word/2010/wordprocessingCanvas" xmlns:mc="http://schemas.openxmlformats.org/markup-compatibility/2006" xmlns:o="urn:schemas-microsoft-com:office:office" xmlns:r="http://schemas.openxmlformats.org/officeDocument/2006/relationships" xmlns:m="http://schemas.openxmlformats.org/officeDocument/2006/math" xmlns:v="urn:schemas-microsoft-com:vml" xmlns:wp14="http://schemas.microsoft.com/office/word/2010/wordprocessingDrawing" xmlns:wp="http://schemas.openxmlformats.org/drawingml/2006/wordprocessingDrawing" xmlns:w10="urn:schemas-microsoft-com:office:word" xmlns:w="http://schemas.openxmlformats.org/wordprocessingml/2006/main" xmlns:w14="http://schemas.microsoft.com/office/word/2010/wordml" xmlns:wpg="http://schemas.microsoft.com/office/word/2010/wordprocessingGroup" xmlns:wpi="http://schemas.microsoft.com/office/word/2010/wordprocessingInk" xmlns:wne="http://schemas.microsoft.com/office/word/2006/wordml" xmlns:wps="http://schemas.microsoft.com/office/word/2010/wordprocessingShape" xmlns:wpsCustomData="http://www.wps.cn/officeDocument/2013/wpsCustomData" mc:Ignorable="w14 wp14">
+  <w:abstractNum w:abstractNumId="0">
+    <w:nsid w:val="0053208E"/>
+    <w:multiLevelType w:val="multilevel"/>
+    <w:tmpl w:val="0053208E"/>
+    <w:lvl w:ilvl="0" w:tentative="0">
+      <w:start w:val="1"/>
+      <w:numFmt w:val="bullet"/>
+      <w:lvlText w:val="●"/>
+      <w:lvlJc w:val="left"/>
+      <w:pPr>
+        <w:ind w:left="720" w:hanging="360"/>
+      </w:pPr>
+    </w:lvl>
+    <w:lvl w:ilvl="1" w:tentative="0">
+      <w:start w:val="1"/>
+      <w:numFmt w:val="bullet"/>
+      <w:lvlText w:val="○"/>
+      <w:lvlJc w:val="left"/>
+      <w:pPr>
+        <w:ind w:left="1440" w:hanging="360"/>
+      </w:pPr>
+    </w:lvl>
+    <w:lvl w:ilvl="2" w:tentative="0">
+      <w:start w:val="1"/>
+      <w:numFmt w:val="bullet"/>
+      <w:lvlText w:val="■"/>
+      <w:lvlJc w:val="left"/>
+      <w:pPr>
+        <w:ind w:left="2160" w:hanging="360"/>
+      </w:pPr>
+    </w:lvl>
+    <w:lvl w:ilvl="3" w:tentative="0">
+      <w:start w:val="1"/>
+      <w:numFmt w:val="bullet"/>
+      <w:lvlText w:val="●"/>
+      <w:lvlJc w:val="left"/>
+      <w:pPr>
+        <w:ind w:left="2880" w:hanging="360"/>
+      </w:pPr>
+    </w:lvl>
+    <w:lvl w:ilvl="4" w:tentative="0">
+      <w:start w:val="1"/>
+      <w:numFmt w:val="bullet"/>
+      <w:lvlText w:val="○"/>
+      <w:lvlJc w:val="left"/>
+      <w:pPr>
+        <w:ind w:left="3600" w:hanging="360"/>
+      </w:pPr>
+    </w:lvl>
+    <w:lvl w:ilvl="5" w:tentative="0">
+      <w:start w:val="1"/>
+      <w:numFmt w:val="bullet"/>
+      <w:lvlText w:val="■"/>
+      <w:lvlJc w:val="left"/>
+      <w:pPr>
+        <w:ind w:left="4320" w:hanging="360"/>
+      </w:pPr>
+    </w:lvl>
+    <w:lvl w:ilvl="6" w:tentative="0">
+      <w:start w:val="1"/>
+      <w:numFmt w:val="bullet"/>
+      <w:lvlText w:val="●"/>
+      <w:lvlJc w:val="left"/>
+      <w:pPr>
+        <w:ind w:left="5040" w:hanging="360"/>
+      </w:pPr>
+    </w:lvl>
+    <w:lvl w:ilvl="7" w:tentative="0">
+      <w:start w:val="1"/>
+      <w:numFmt w:val="bullet"/>
+      <w:lvlText w:val="●"/>
+      <w:lvlJc w:val="left"/>
+      <w:pPr>
+        <w:ind w:left="5760" w:hanging="360"/>
+      </w:pPr>
+    </w:lvl>
+    <w:lvl w:ilvl="8" w:tentative="0">
+      <w:start w:val="1"/>
+      <w:numFmt w:val="bullet"/>
+      <w:lvlText w:val="●"/>
+      <w:lvlJc w:val="left"/>
+      <w:pPr>
+        <w:ind w:left="6480" w:hanging="360"/>
+      </w:pPr>
+    </w:lvl>
+  </w:abstractNum>
+  <w:num w:numId="1">
+    <w:abstractNumId w:val="0"/>
+    <w:lvlOverride w:ilvl="0">
+      <w:startOverride w:val="1"/>
+    </w:lvlOverride>
+  </w:num>
+</w:numbering>
 </file>
 
 <file path=word/styles.xml><?xml version="1.0" encoding="utf-8"?>
@@ -8622,6 +9400,7 @@
     <w:lsdException w:unhideWhenUsed="0" w:uiPriority="63" w:semiHidden="0" w:name="Medium Shading 1 Accent 1"/>
     <w:lsdException w:unhideWhenUsed="0" w:uiPriority="64" w:semiHidden="0" w:name="Medium Shading 2 Accent 1"/>
     <w:lsdException w:unhideWhenUsed="0" w:uiPriority="65" w:semiHidden="0" w:name="Medium List 1 Accent 1"/>
+    <w:lsdException w:qFormat="1" w:unhideWhenUsed="0" w:uiPriority="0" w:semiHidden="0" w:name="List Paragraph"/>
     <w:lsdException w:unhideWhenUsed="0" w:uiPriority="66" w:semiHidden="0" w:name="Medium List 2 Accent 1"/>
     <w:lsdException w:unhideWhenUsed="0" w:uiPriority="67" w:semiHidden="0" w:name="Medium Grid 1 Accent 1"/>
     <w:lsdException w:unhideWhenUsed="0" w:uiPriority="68" w:semiHidden="0" w:name="Medium Grid 2 Accent 1"/>
@@ -8799,6 +9578,16 @@
     <w:rPr>
       <w:b/>
       <w:bCs/>
+    </w:rPr>
+  </w:style>
+  <w:style w:type="paragraph" w:styleId="9">
+    <w:name w:val="List Paragraph"/>
+    <w:qFormat/>
+    <w:uiPriority w:val="0"/>
+    <w:rPr>
+      <w:rFonts w:ascii="Calibri" w:hAnsi="Calibri" w:eastAsia="Calibri" w:cs="Calibri"/>
+      <w:sz w:val="22"/>
+      <w:szCs w:val="22"/>
     </w:rPr>
   </w:style>
 </w:styles>

</xml_diff>